<commit_message>
Add PDF versions of the Word documents
PDFs of the 2020 protocol and methods handout and the two BIOL 3400
worksheets, so they preview on GitHub, plus the wording fixes made in the
two experimental-evolution documents. The plot-output ignore rule now covers
only the competition/ and growth/ script folders.

Co-Authored-By: Claude Opus 5.5 <noreply@anthropic.com>
</commit_message>
<xml_diff>
--- a/experimental-evolution-2020/Measuring_fitness_costs.docx
+++ b/experimental-evolution-2020/Measuring_fitness_costs.docx
@@ -1,9 +1,10 @@
 
 <file path=word/document.xml><?xml version="1.0" encoding="utf-8"?>
-<w:document xmlns:wpc="http://schemas.microsoft.com/office/word/2010/wordprocessingCanvas" xmlns:cx="http://schemas.microsoft.com/office/drawing/2014/chartex" xmlns:cx1="http://schemas.microsoft.com/office/drawing/2015/9/8/chartex" xmlns:cx2="http://schemas.microsoft.com/office/drawing/2015/10/21/chartex" xmlns:cx3="http://schemas.microsoft.com/office/drawing/2016/5/9/chartex" xmlns:cx4="http://schemas.microsoft.com/office/drawing/2016/5/10/chartex" xmlns:cx5="http://schemas.microsoft.com/office/drawing/2016/5/11/chartex" xmlns:cx6="http://schemas.microsoft.com/office/drawing/2016/5/12/chartex" xmlns:cx7="http://schemas.microsoft.com/office/drawing/2016/5/13/chartex" xmlns:cx8="http://schemas.microsoft.com/office/drawing/2016/5/14/chartex" xmlns:mc="http://schemas.openxmlformats.org/markup-compatibility/2006" xmlns:aink="http://schemas.microsoft.com/office/drawing/2016/ink" xmlns:am3d="http://schemas.microsoft.com/office/drawing/2017/model3d" xmlns:o="urn:schemas-microsoft-com:office:office" xmlns:r="http://schemas.openxmlformats.org/officeDocument/2006/relationships" xmlns:m="http://schemas.openxmlformats.org/officeDocument/2006/math" xmlns:v="urn:schemas-microsoft-com:vml" xmlns:wp14="http://schemas.microsoft.com/office/word/2010/wordprocessingDrawing" xmlns:wp="http://schemas.openxmlformats.org/drawingml/2006/wordprocessingDrawing" xmlns:w10="urn:schemas-microsoft-com:office:word" xmlns:w="http://schemas.openxmlformats.org/wordprocessingml/2006/main" xmlns:w14="http://schemas.microsoft.com/office/word/2010/wordml" xmlns:w15="http://schemas.microsoft.com/office/word/2012/wordml" xmlns:w16cex="http://schemas.microsoft.com/office/word/2018/wordml/cex" xmlns:w16cid="http://schemas.microsoft.com/office/word/2016/wordml/cid" xmlns:w16="http://schemas.microsoft.com/office/word/2018/wordml" xmlns:w16se="http://schemas.microsoft.com/office/word/2015/wordml/symex" xmlns:wpg="http://schemas.microsoft.com/office/word/2010/wordprocessingGroup" xmlns:wpi="http://schemas.microsoft.com/office/word/2010/wordprocessingInk" xmlns:wne="http://schemas.microsoft.com/office/word/2006/wordml" xmlns:wps="http://schemas.microsoft.com/office/word/2010/wordprocessingShape" mc:Ignorable="w14 w15 w16se w16cid w16 w16cex wp14">
+<w:document xmlns:wpc="http://schemas.microsoft.com/office/word/2010/wordprocessingCanvas" xmlns:cx="http://schemas.microsoft.com/office/drawing/2014/chartex" xmlns:cx1="http://schemas.microsoft.com/office/drawing/2015/9/8/chartex" xmlns:cx2="http://schemas.microsoft.com/office/drawing/2015/10/21/chartex" xmlns:cx3="http://schemas.microsoft.com/office/drawing/2016/5/9/chartex" xmlns:cx4="http://schemas.microsoft.com/office/drawing/2016/5/10/chartex" xmlns:cx5="http://schemas.microsoft.com/office/drawing/2016/5/11/chartex" xmlns:cx6="http://schemas.microsoft.com/office/drawing/2016/5/12/chartex" xmlns:cx7="http://schemas.microsoft.com/office/drawing/2016/5/13/chartex" xmlns:cx8="http://schemas.microsoft.com/office/drawing/2016/5/14/chartex" xmlns:mc="http://schemas.openxmlformats.org/markup-compatibility/2006" xmlns:m="http://schemas.openxmlformats.org/officeDocument/2006/math" xmlns:aink="http://schemas.microsoft.com/office/drawing/2016/ink" xmlns:am3d="http://schemas.microsoft.com/office/drawing/2017/model3d" xmlns:oel="http://schemas.microsoft.com/office/2019/extlst" xmlns:r="http://schemas.openxmlformats.org/officeDocument/2006/relationships" xmlns:wp14="http://schemas.microsoft.com/office/word/2010/wordprocessingDrawing" xmlns:wp="http://schemas.openxmlformats.org/drawingml/2006/wordprocessingDrawing" xmlns:wpg="http://schemas.microsoft.com/office/word/2010/wordprocessingGroup" xmlns:wpi="http://schemas.microsoft.com/office/word/2010/wordprocessingInk" xmlns:wps="http://schemas.microsoft.com/office/word/2010/wordprocessingShape" xmlns:o="urn:schemas-microsoft-com:office:office" xmlns:v="urn:schemas-microsoft-com:vml" xmlns:w10="urn:schemas-microsoft-com:office:word" xmlns:w="http://schemas.openxmlformats.org/wordprocessingml/2006/main" xmlns:w14="http://schemas.microsoft.com/office/word/2010/wordml" xmlns:w15="http://schemas.microsoft.com/office/word/2012/wordml" xmlns:w16cex="http://schemas.microsoft.com/office/word/2018/wordml/cex" xmlns:w16cid="http://schemas.microsoft.com/office/word/2016/wordml/cid" xmlns:w16="http://schemas.microsoft.com/office/word/2018/wordml" xmlns:w16sdtdh="http://schemas.microsoft.com/office/word/2020/wordml/sdtdatahash" xmlns:w16sdtfl="http://schemas.microsoft.com/office/word/2024/wordml/sdtformatlock" xmlns:w16se="http://schemas.microsoft.com/office/word/2015/wordml/symex" xmlns:w16du="http://schemas.microsoft.com/office/word/2023/wordml/word16du" xmlns:wne="http://schemas.microsoft.com/office/word/2006/wordml" mc:Ignorable="w14 w15 w16se w16cid w16 w16cex w16sdtdh w16sdtfl w16du wp14">
   <w:body>
     <w:p>
       <w:pPr>
+        <w:spacing w:line="360" w:lineRule="auto"/>
         <w:rPr>
           <w:b/>
           <w:bCs/>
@@ -21,6 +22,7 @@
     </w:p>
     <w:p>
       <w:pPr>
+        <w:spacing w:line="360" w:lineRule="auto"/>
         <w:rPr>
           <w:lang w:val="en-US"/>
         </w:rPr>
@@ -28,6 +30,7 @@
     </w:p>
     <w:p>
       <w:pPr>
+        <w:spacing w:line="360" w:lineRule="auto"/>
         <w:rPr>
           <w:lang w:val="en-US"/>
         </w:rPr>
@@ -38,7 +41,23 @@
           <w:bCs/>
           <w:lang w:val="en-US"/>
         </w:rPr>
-        <w:t xml:space="preserve">Keywords </w:t>
+        <w:t>Keywords</w:t>
+      </w:r>
+      <w:r>
+        <w:rPr>
+          <w:b/>
+          <w:bCs/>
+          <w:lang w:val="en-US"/>
+        </w:rPr>
+        <w:t>:</w:t>
+      </w:r>
+      <w:r>
+        <w:rPr>
+          <w:b/>
+          <w:bCs/>
+          <w:lang w:val="en-US"/>
+        </w:rPr>
+        <w:t xml:space="preserve"> </w:t>
       </w:r>
       <w:r>
         <w:rPr>
@@ -55,6 +74,7 @@
     </w:p>
     <w:p>
       <w:pPr>
+        <w:spacing w:line="360" w:lineRule="auto"/>
         <w:rPr>
           <w:lang w:val="en-US"/>
         </w:rPr>
@@ -62,6 +82,7 @@
     </w:p>
     <w:p>
       <w:pPr>
+        <w:spacing w:line="360" w:lineRule="auto"/>
         <w:rPr>
           <w:b/>
           <w:bCs/>
@@ -79,6 +100,7 @@
     </w:p>
     <w:p>
       <w:pPr>
+        <w:spacing w:line="360" w:lineRule="auto"/>
         <w:rPr>
           <w:b/>
           <w:bCs/>
@@ -88,6 +110,7 @@
     </w:p>
     <w:p>
       <w:pPr>
+        <w:spacing w:line="360" w:lineRule="auto"/>
         <w:rPr>
           <w:lang w:val="en-US"/>
         </w:rPr>
@@ -110,21 +133,31 @@
         <w:rPr>
           <w:lang w:val="en-US"/>
         </w:rPr>
-        <w:t xml:space="preserve"> predators and </w:t>
-      </w:r>
-      <w:proofErr w:type="spellStart"/>
-      <w:r>
-        <w:rPr>
-          <w:lang w:val="en-US"/>
-        </w:rPr>
-        <w:t>competitiors</w:t>
-      </w:r>
-      <w:proofErr w:type="spellEnd"/>
-      <w:r>
-        <w:rPr>
-          <w:lang w:val="en-US"/>
-        </w:rPr>
-        <w:t xml:space="preserve">) and abiotic (e.g. antibiotics and resource limitations) environments. Understanding how populations response to these challenges via, for instance, standing genetic variation or </w:t>
+        <w:t xml:space="preserve"> predators and competitors) and abiotic (e.g.</w:t>
+      </w:r>
+      <w:r>
+        <w:rPr>
+          <w:lang w:val="en-US"/>
+        </w:rPr>
+        <w:t>,</w:t>
+      </w:r>
+      <w:r>
+        <w:rPr>
+          <w:lang w:val="en-US"/>
+        </w:rPr>
+        <w:t xml:space="preserve"> antibiotics and resource limitations) environments. Understanding how populations respon</w:t>
+      </w:r>
+      <w:r>
+        <w:rPr>
+          <w:lang w:val="en-US"/>
+        </w:rPr>
+        <w:t>d</w:t>
+      </w:r>
+      <w:r>
+        <w:rPr>
+          <w:lang w:val="en-US"/>
+        </w:rPr>
+        <w:t xml:space="preserve"> to these challenges via, for instance, standing genetic variation or </w:t>
       </w:r>
       <w:r>
         <w:rPr>
@@ -138,11 +171,26 @@
         <w:rPr>
           <w:lang w:val="en-US"/>
         </w:rPr>
-        <w:t>mutations is of great importance. Adaptations to novel environments come with the fitness costs relative to the ancestral populations, which might be, for instance, a disadvantage in different environmental conditions.</w:t>
+        <w:t xml:space="preserve">mutations </w:t>
+      </w:r>
+      <w:proofErr w:type="gramStart"/>
+      <w:r>
+        <w:rPr>
+          <w:lang w:val="en-US"/>
+        </w:rPr>
+        <w:t>is</w:t>
+      </w:r>
+      <w:proofErr w:type="gramEnd"/>
+      <w:r>
+        <w:rPr>
+          <w:lang w:val="en-US"/>
+        </w:rPr>
+        <w:t xml:space="preserve"> of great importance. Adaptations to novel environments come with fitness costs relative to the ancestral populations, which might be, for instance, a disadvantage in different environmental conditions.</w:t>
       </w:r>
     </w:p>
     <w:p>
       <w:pPr>
+        <w:spacing w:line="360" w:lineRule="auto"/>
         <w:rPr>
           <w:lang w:val="en-US"/>
         </w:rPr>
@@ -150,6 +198,7 @@
     </w:p>
     <w:p>
       <w:pPr>
+        <w:spacing w:line="360" w:lineRule="auto"/>
         <w:rPr>
           <w:b/>
           <w:bCs/>
@@ -167,6 +216,7 @@
     </w:p>
     <w:p>
       <w:pPr>
+        <w:spacing w:line="360" w:lineRule="auto"/>
         <w:rPr>
           <w:b/>
           <w:bCs/>
@@ -176,6 +226,7 @@
     </w:p>
     <w:p>
       <w:pPr>
+        <w:spacing w:line="360" w:lineRule="auto"/>
         <w:rPr>
           <w:i/>
           <w:iCs/>
@@ -193,6 +244,7 @@
     </w:p>
     <w:p>
       <w:pPr>
+        <w:spacing w:line="360" w:lineRule="auto"/>
         <w:rPr>
           <w:b/>
           <w:bCs/>
@@ -202,6 +254,7 @@
     </w:p>
     <w:p>
       <w:pPr>
+        <w:spacing w:line="360" w:lineRule="auto"/>
         <w:rPr>
           <w:rFonts w:cstheme="minorHAnsi"/>
           <w:iCs/>
@@ -221,7 +274,7 @@
           <w:rFonts w:cstheme="minorHAnsi"/>
           <w:iCs/>
         </w:rPr>
-        <w:t>E. coli strain B E. coli REL607 (</w:t>
+        <w:t>E. coli strain B</w:t>
       </w:r>
       <w:r>
         <w:rPr>
@@ -229,6 +282,21 @@
           <w:iCs/>
           <w:lang w:val="en-US"/>
         </w:rPr>
+        <w:t>,</w:t>
+      </w:r>
+      <w:r>
+        <w:rPr>
+          <w:rFonts w:cstheme="minorHAnsi"/>
+          <w:iCs/>
+        </w:rPr>
+        <w:t xml:space="preserve"> E. coli REL607 (</w:t>
+      </w:r>
+      <w:r>
+        <w:rPr>
+          <w:rFonts w:cstheme="minorHAnsi"/>
+          <w:iCs/>
+          <w:lang w:val="en-US"/>
+        </w:rPr>
         <w:t xml:space="preserve">with a genomic marker </w:t>
       </w:r>
       <w:r>
@@ -244,7 +312,39 @@
           <w:iCs/>
           <w:lang w:val="en-US"/>
         </w:rPr>
-        <w:t>evolved in different environments, i.e. different antibiotic concentrations or in presence or absence of l</w:t>
+        <w:t>evolved in different environments, i.e.</w:t>
+      </w:r>
+      <w:r>
+        <w:rPr>
+          <w:rFonts w:cstheme="minorHAnsi"/>
+          <w:iCs/>
+          <w:lang w:val="en-US"/>
+        </w:rPr>
+        <w:t>,</w:t>
+      </w:r>
+      <w:r>
+        <w:rPr>
+          <w:rFonts w:cstheme="minorHAnsi"/>
+          <w:iCs/>
+          <w:lang w:val="en-US"/>
+        </w:rPr>
+        <w:t xml:space="preserve"> different antibiotic concentrations or in </w:t>
+      </w:r>
+      <w:r>
+        <w:rPr>
+          <w:rFonts w:cstheme="minorHAnsi"/>
+          <w:iCs/>
+          <w:lang w:val="en-US"/>
+        </w:rPr>
+        <w:t xml:space="preserve">the </w:t>
+      </w:r>
+      <w:r>
+        <w:rPr>
+          <w:rFonts w:cstheme="minorHAnsi"/>
+          <w:iCs/>
+          <w:lang w:val="en-US"/>
+        </w:rPr>
+        <w:t>presence or absence of l</w:t>
       </w:r>
       <w:r>
         <w:rPr>
@@ -339,6 +439,7 @@
     </w:p>
     <w:p>
       <w:pPr>
+        <w:spacing w:line="360" w:lineRule="auto"/>
         <w:rPr>
           <w:rFonts w:cstheme="minorHAnsi"/>
           <w:iCs/>
@@ -353,17 +454,48 @@
           <w:ilvl w:val="0"/>
           <w:numId w:val="1"/>
         </w:numPr>
-        <w:rPr>
-          <w:rFonts w:cstheme="minorHAnsi"/>
-          <w:color w:val="231F20"/>
-        </w:rPr>
-      </w:pPr>
-      <w:r>
-        <w:rPr>
-          <w:rFonts w:cstheme="minorHAnsi"/>
-          <w:color w:val="231F20"/>
-        </w:rPr>
-        <w:t xml:space="preserve">In order to define if any of the resistance has a fitness cost, all isolated clones of evolved focal species will be replicated into </w:t>
+        <w:spacing w:line="360" w:lineRule="auto"/>
+        <w:rPr>
+          <w:rFonts w:cstheme="minorHAnsi"/>
+          <w:color w:val="231F20"/>
+        </w:rPr>
+      </w:pPr>
+      <w:r>
+        <w:rPr>
+          <w:rFonts w:cstheme="minorHAnsi"/>
+          <w:color w:val="231F20"/>
+        </w:rPr>
+        <w:t>In order to de</w:t>
+      </w:r>
+      <w:r>
+        <w:rPr>
+          <w:rFonts w:cstheme="minorHAnsi"/>
+          <w:color w:val="231F20"/>
+          <w:lang w:val="en-US"/>
+        </w:rPr>
+        <w:t>term</w:t>
+      </w:r>
+      <w:r>
+        <w:rPr>
+          <w:rFonts w:cstheme="minorHAnsi"/>
+          <w:color w:val="231F20"/>
+        </w:rPr>
+        <w:t xml:space="preserve">ine if any of the resistance has a fitness cost, all isolated clones of </w:t>
+      </w:r>
+      <w:r>
+        <w:rPr>
+          <w:rFonts w:cstheme="minorHAnsi"/>
+          <w:color w:val="231F20"/>
+          <w:lang w:val="en-US"/>
+        </w:rPr>
+        <w:t xml:space="preserve">the </w:t>
+      </w:r>
+      <w:r>
+        <w:rPr>
+          <w:rFonts w:cstheme="minorHAnsi"/>
+          <w:color w:val="231F20"/>
+        </w:rPr>
+        <w:t xml:space="preserve">evolved focal species will be replicated into </w:t>
       </w:r>
       <w:r>
         <w:rPr>
@@ -386,14 +518,14 @@
           <w:color w:val="231F20"/>
           <w:lang w:val="en-US"/>
         </w:rPr>
-        <w:t>cult</w:t>
-      </w:r>
-      <w:r>
-        <w:rPr>
-          <w:rFonts w:cstheme="minorHAnsi"/>
-          <w:color w:val="231F20"/>
-        </w:rPr>
-        <w:t xml:space="preserve"> containing </w:t>
+        <w:t>of</w:t>
+      </w:r>
+      <w:r>
+        <w:rPr>
+          <w:rFonts w:cstheme="minorHAnsi"/>
+          <w:color w:val="231F20"/>
+        </w:rPr>
+        <w:t xml:space="preserve"> </w:t>
       </w:r>
       <w:r>
         <w:rPr>
@@ -408,7 +540,37 @@
           <w:rFonts w:cstheme="minorHAnsi"/>
           <w:color w:val="231F20"/>
         </w:rPr>
-        <w:t xml:space="preserve"> media and grown 24 h at 3</w:t>
+        <w:t xml:space="preserve"> medi</w:t>
+      </w:r>
+      <w:r>
+        <w:rPr>
+          <w:rFonts w:cstheme="minorHAnsi"/>
+          <w:color w:val="231F20"/>
+          <w:lang w:val="en-US"/>
+        </w:rPr>
+        <w:t>um</w:t>
+      </w:r>
+      <w:r>
+        <w:rPr>
+          <w:rFonts w:cstheme="minorHAnsi"/>
+          <w:color w:val="231F20"/>
+        </w:rPr>
+        <w:t xml:space="preserve"> and grown </w:t>
+      </w:r>
+      <w:r>
+        <w:rPr>
+          <w:rFonts w:cstheme="minorHAnsi"/>
+          <w:color w:val="231F20"/>
+          <w:lang w:val="en-US"/>
+        </w:rPr>
+        <w:t xml:space="preserve">for </w:t>
+      </w:r>
+      <w:r>
+        <w:rPr>
+          <w:rFonts w:cstheme="minorHAnsi"/>
+          <w:color w:val="231F20"/>
+        </w:rPr>
+        <w:t>24 h at 3</w:t>
       </w:r>
       <w:r>
         <w:rPr>
@@ -437,12 +599,36 @@
         <w:rPr>
           <w:rFonts w:cstheme="minorHAnsi"/>
           <w:color w:val="231F20"/>
-        </w:rPr>
-        <w:t xml:space="preserve">Ancestral clone will be also grown in the same conditions. </w:t>
+          <w:lang w:val="en-US"/>
+        </w:rPr>
+        <w:t>The a</w:t>
+      </w:r>
+      <w:r>
+        <w:rPr>
+          <w:rFonts w:cstheme="minorHAnsi"/>
+          <w:color w:val="231F20"/>
+        </w:rPr>
+        <w:t>ncestral clone will also</w:t>
+      </w:r>
+      <w:r>
+        <w:rPr>
+          <w:rFonts w:cstheme="minorHAnsi"/>
+          <w:color w:val="231F20"/>
+          <w:lang w:val="en-US"/>
+        </w:rPr>
+        <w:t xml:space="preserve"> be</w:t>
+      </w:r>
+      <w:r>
+        <w:rPr>
+          <w:rFonts w:cstheme="minorHAnsi"/>
+          <w:color w:val="231F20"/>
+        </w:rPr>
+        <w:t xml:space="preserve"> grown in the same conditions. </w:t>
       </w:r>
     </w:p>
     <w:p>
       <w:pPr>
+        <w:spacing w:line="360" w:lineRule="auto"/>
         <w:rPr>
           <w:rFonts w:cstheme="minorHAnsi"/>
           <w:color w:val="231F20"/>
@@ -456,17 +642,34 @@
           <w:ilvl w:val="0"/>
           <w:numId w:val="1"/>
         </w:numPr>
-        <w:rPr>
-          <w:rFonts w:cstheme="minorHAnsi"/>
-          <w:color w:val="231F20"/>
-        </w:rPr>
-      </w:pPr>
-      <w:r>
-        <w:rPr>
-          <w:rFonts w:cstheme="minorHAnsi"/>
-          <w:color w:val="231F20"/>
-        </w:rPr>
-        <w:t>Every clone will be diluted 100 times (~10</w:t>
+        <w:spacing w:line="360" w:lineRule="auto"/>
+        <w:rPr>
+          <w:rFonts w:cstheme="minorHAnsi"/>
+          <w:color w:val="231F20"/>
+        </w:rPr>
+      </w:pPr>
+      <w:r>
+        <w:rPr>
+          <w:rFonts w:cstheme="minorHAnsi"/>
+          <w:color w:val="231F20"/>
+        </w:rPr>
+        <w:lastRenderedPageBreak/>
+        <w:t>Every clone will be diluted 100</w:t>
+      </w:r>
+      <w:r>
+        <w:rPr>
+          <w:rFonts w:cstheme="minorHAnsi"/>
+          <w:color w:val="231F20"/>
+          <w:lang w:val="en-US"/>
+        </w:rPr>
+        <w:t>-fold</w:t>
+      </w:r>
+      <w:r>
+        <w:rPr>
+          <w:rFonts w:cstheme="minorHAnsi"/>
+          <w:color w:val="231F20"/>
+        </w:rPr>
+        <w:t xml:space="preserve"> (~10</w:t>
       </w:r>
       <w:r>
         <w:rPr>
@@ -516,6 +719,7 @@
     </w:p>
     <w:p>
       <w:pPr>
+        <w:spacing w:line="360" w:lineRule="auto"/>
         <w:rPr>
           <w:rFonts w:cstheme="minorHAnsi"/>
           <w:color w:val="231F20"/>
@@ -529,6 +733,7 @@
           <w:ilvl w:val="0"/>
           <w:numId w:val="1"/>
         </w:numPr>
+        <w:spacing w:line="360" w:lineRule="auto"/>
         <w:rPr>
           <w:b/>
           <w:bCs/>
@@ -555,7 +760,22 @@
           <w:rFonts w:cstheme="minorHAnsi"/>
           <w:color w:val="231F20"/>
         </w:rPr>
-        <w:t xml:space="preserve">°C, cultures will be plates on </w:t>
+        <w:t>°C, cultures will be plate</w:t>
+      </w:r>
+      <w:r>
+        <w:rPr>
+          <w:rFonts w:cstheme="minorHAnsi"/>
+          <w:color w:val="231F20"/>
+          <w:lang w:val="en-US"/>
+        </w:rPr>
+        <w:t>d</w:t>
+      </w:r>
+      <w:r>
+        <w:rPr>
+          <w:rFonts w:cstheme="minorHAnsi"/>
+          <w:color w:val="231F20"/>
+        </w:rPr>
+        <w:t xml:space="preserve"> on </w:t>
       </w:r>
       <w:r>
         <w:rPr>
@@ -578,7 +798,23 @@
           <w:color w:val="231F20"/>
           <w:lang w:val="en-US"/>
         </w:rPr>
-        <w:t xml:space="preserve"> using following equation</w:t>
+        <w:t xml:space="preserve"> using </w:t>
+      </w:r>
+      <w:r>
+        <w:rPr>
+          <w:rFonts w:cstheme="minorHAnsi"/>
+          <w:color w:val="231F20"/>
+          <w:lang w:val="en-US"/>
+        </w:rPr>
+        <w:t xml:space="preserve">the </w:t>
+      </w:r>
+      <w:r>
+        <w:rPr>
+          <w:rFonts w:cstheme="minorHAnsi"/>
+          <w:color w:val="231F20"/>
+          <w:lang w:val="en-US"/>
+        </w:rPr>
+        <w:t>following equation</w:t>
       </w:r>
       <w:r>
         <w:rPr>
@@ -592,6 +828,7 @@
     <w:p>
       <w:pPr>
         <w:pStyle w:val="ListParagraph"/>
+        <w:spacing w:line="360" w:lineRule="auto"/>
         <w:rPr>
           <w:b/>
           <w:bCs/>
@@ -602,6 +839,7 @@
     <w:p>
       <w:pPr>
         <w:pStyle w:val="ListParagraph"/>
+        <w:spacing w:line="360" w:lineRule="auto"/>
         <w:rPr>
           <w:b/>
           <w:bCs/>
@@ -1098,16 +1336,7 @@
                 <w:szCs w:val="24"/>
                 <w:lang w:val="en-US"/>
               </w:rPr>
-              <w:t>selection coefficient</w:t>
-            </w:r>
-            <w:r>
-              <w:rPr>
-                <w:rFonts w:ascii="Cambria Math" w:hAnsi="Cambria Math"/>
-                <w:sz w:val="24"/>
-                <w:szCs w:val="24"/>
-                <w:lang w:val="en-US"/>
-              </w:rPr>
-              <w:t xml:space="preserve"> (&gt;1 indicates higher fitness of evolved lines relative to the ancestor)</w:t>
+              <w:t>selection coefficient (&gt;1 indicates higher fitness of evolved lines relative to the ancestor)</w:t>
             </w:r>
           </w:p>
         </w:tc>
@@ -1773,6 +2002,7 @@
     </w:tbl>
     <w:p>
       <w:pPr>
+        <w:spacing w:line="360" w:lineRule="auto"/>
         <w:rPr>
           <w:b/>
           <w:bCs/>
@@ -1781,6 +2011,7 @@
     </w:p>
     <w:p>
       <w:pPr>
+        <w:spacing w:line="360" w:lineRule="auto"/>
         <w:rPr>
           <w:b/>
           <w:bCs/>
@@ -1790,6 +2021,7 @@
     </w:p>
     <w:p>
       <w:pPr>
+        <w:spacing w:line="360" w:lineRule="auto"/>
         <w:rPr>
           <w:i/>
           <w:iCs/>
@@ -1807,6 +2039,7 @@
     </w:p>
     <w:p>
       <w:pPr>
+        <w:spacing w:line="360" w:lineRule="auto"/>
         <w:rPr>
           <w:i/>
           <w:iCs/>
@@ -1816,6 +2049,7 @@
     </w:p>
     <w:p>
       <w:pPr>
+        <w:spacing w:line="360" w:lineRule="auto"/>
         <w:rPr>
           <w:rFonts w:eastAsiaTheme="minorEastAsia" w:cstheme="minorHAnsi"/>
           <w:i/>
@@ -1859,7 +2093,20 @@
         <w:rPr>
           <w:rFonts w:cstheme="minorHAnsi"/>
         </w:rPr>
-        <w:t>media and the OD</w:t>
+        <w:t>media</w:t>
+      </w:r>
+      <w:r>
+        <w:rPr>
+          <w:rFonts w:cstheme="minorHAnsi"/>
+          <w:lang w:val="en-US"/>
+        </w:rPr>
+        <w:t>,</w:t>
+      </w:r>
+      <w:r>
+        <w:rPr>
+          <w:rFonts w:cstheme="minorHAnsi"/>
+        </w:rPr>
+        <w:t xml:space="preserve"> and the OD</w:t>
       </w:r>
       <w:r>
         <w:rPr>
@@ -1872,20 +2119,27 @@
         <w:rPr>
           <w:rFonts w:cstheme="minorHAnsi"/>
         </w:rPr>
-        <w:t xml:space="preserve">will be measured with </w:t>
-      </w:r>
-      <w:r>
-        <w:rPr>
-          <w:rFonts w:cstheme="minorHAnsi"/>
-          <w:lang w:val="en-US"/>
-        </w:rPr>
-        <w:t>15</w:t>
-      </w:r>
-      <w:r>
-        <w:rPr>
-          <w:rFonts w:cstheme="minorHAnsi"/>
-        </w:rPr>
-        <w:t xml:space="preserve"> min</w:t>
+        <w:t xml:space="preserve">will be measured </w:t>
+      </w:r>
+      <w:r>
+        <w:rPr>
+          <w:rFonts w:cstheme="minorHAnsi"/>
+          <w:lang w:val="en-US"/>
+        </w:rPr>
+        <w:t>at</w:t>
+      </w:r>
+      <w:r>
+        <w:rPr>
+          <w:rFonts w:cstheme="minorHAnsi"/>
+        </w:rPr>
+        <w:t xml:space="preserve"> </w:t>
+      </w:r>
+      <w:r>
+        <w:rPr>
+          <w:rFonts w:cstheme="minorHAnsi"/>
+          <w:lang w:val="en-US"/>
+        </w:rPr>
+        <w:t>15-minute</w:t>
       </w:r>
       <w:r>
         <w:rPr>
@@ -2101,7 +2355,7 @@
         <w:rPr>
           <w:rFonts w:eastAsiaTheme="minorEastAsia" w:cstheme="minorHAnsi"/>
         </w:rPr>
-        <w:t xml:space="preserve">. Where </w:t>
+        <w:t xml:space="preserve"> Where </w:t>
       </w:r>
       <m:oMath>
         <m:sSub>
@@ -2216,6 +2470,7 @@
     </w:p>
     <w:p>
       <w:pPr>
+        <w:spacing w:line="360" w:lineRule="auto"/>
         <w:rPr>
           <w:rFonts w:eastAsiaTheme="minorEastAsia" w:cstheme="minorHAnsi"/>
           <w:i/>
@@ -2225,6 +2480,7 @@
     </w:p>
     <w:p>
       <w:pPr>
+        <w:spacing w:line="360" w:lineRule="auto"/>
         <w:rPr>
           <w:rFonts w:eastAsiaTheme="minorEastAsia" w:cstheme="minorHAnsi"/>
           <w:i/>
@@ -2234,6 +2490,7 @@
     </w:p>
     <w:p>
       <w:pPr>
+        <w:spacing w:line="360" w:lineRule="auto"/>
         <w:rPr>
           <w:rFonts w:eastAsiaTheme="minorEastAsia" w:cstheme="minorHAnsi"/>
           <w:i/>
@@ -2251,6 +2508,7 @@
     </w:p>
     <w:p>
       <w:pPr>
+        <w:spacing w:line="360" w:lineRule="auto"/>
         <w:rPr>
           <w:rFonts w:eastAsiaTheme="minorEastAsia" w:cstheme="minorHAnsi"/>
           <w:i/>
@@ -2276,6 +2534,7 @@
           <w:szCs w:val="24"/>
           <w:lang w:val="en-US"/>
         </w:rPr>
+        <w:lastRenderedPageBreak/>
         <w:t>Phage resistance</w:t>
       </w:r>
       <w:r>
@@ -2369,7 +2628,7 @@
           <w:szCs w:val="24"/>
           <w:lang w:val="en-US"/>
         </w:rPr>
-        <w:t xml:space="preserve"> phage </w:t>
+        <w:t xml:space="preserve"> phage particles</w:t>
       </w:r>
       <w:r>
         <w:rPr>
@@ -2377,7 +2636,7 @@
           <w:szCs w:val="24"/>
           <w:lang w:val="en-US"/>
         </w:rPr>
-        <w:t>particles</w:t>
+        <w:t>,</w:t>
       </w:r>
       <w:r>
         <w:rPr>
@@ -2413,39 +2672,43 @@
           <w:szCs w:val="24"/>
           <w:lang w:val="en-US"/>
         </w:rPr>
-        <w:t xml:space="preserve">will be measured with 15 min intervals in an automated microplate at 30°C for 48 h. </w:t>
-      </w:r>
-      <w:r>
-        <w:rPr>
+        <w:t xml:space="preserve">will be measured </w:t>
+      </w:r>
+      <w:r>
+        <w:rPr>
+          <w:rFonts w:cstheme="minorHAnsi"/>
           <w:sz w:val="24"/>
           <w:szCs w:val="24"/>
           <w:lang w:val="en-US"/>
         </w:rPr>
-        <w:t>Additionally, the virulence of the bacteriophage T4 was determined using the growth curves in presence of T4 bacteriophages</w:t>
-      </w:r>
-      <w:r>
-        <w:rPr>
+        <w:t>at</w:t>
+      </w:r>
+      <w:r>
+        <w:rPr>
+          <w:rFonts w:cstheme="minorHAnsi"/>
           <w:sz w:val="24"/>
           <w:szCs w:val="24"/>
           <w:lang w:val="en-US"/>
         </w:rPr>
-        <w:t xml:space="preserve">. </w:t>
-      </w:r>
-      <w:r>
-        <w:rPr>
+        <w:t xml:space="preserve"> </w:t>
+      </w:r>
+      <w:r>
+        <w:rPr>
+          <w:rFonts w:cstheme="minorHAnsi"/>
           <w:sz w:val="24"/>
           <w:szCs w:val="24"/>
           <w:lang w:val="en-US"/>
         </w:rPr>
-        <w:t>Therefore, were added into the 3 replicates of diluted cultures</w:t>
-      </w:r>
-      <w:r>
-        <w:rPr>
+        <w:t>15-minute</w:t>
+      </w:r>
+      <w:r>
+        <w:rPr>
+          <w:rFonts w:cstheme="minorHAnsi"/>
           <w:sz w:val="24"/>
           <w:szCs w:val="24"/>
           <w:lang w:val="en-US"/>
         </w:rPr>
-        <w:t>. Resistance will be estimated using liquid assay sco</w:t>
+        <w:t xml:space="preserve"> intervals in an automated microplate at 30°C for 48 h. </w:t>
       </w:r>
       <w:r>
         <w:rPr>
@@ -2453,7 +2716,71 @@
           <w:szCs w:val="24"/>
           <w:lang w:val="en-US"/>
         </w:rPr>
-        <w:t xml:space="preserve">re by calculating area under the curve for both growth curves with and without phages: </w:t>
+        <w:t xml:space="preserve">Additionally, the virulence of the bacteriophage T4 was determined using the growth curves in </w:t>
+      </w:r>
+      <w:r>
+        <w:rPr>
+          <w:sz w:val="24"/>
+          <w:szCs w:val="24"/>
+          <w:lang w:val="en-US"/>
+        </w:rPr>
+        <w:t xml:space="preserve">the </w:t>
+      </w:r>
+      <w:r>
+        <w:rPr>
+          <w:sz w:val="24"/>
+          <w:szCs w:val="24"/>
+          <w:lang w:val="en-US"/>
+        </w:rPr>
+        <w:t>presence of T4 bacteriophages. Therefore, were added to the 3 replicates of diluted cultures</w:t>
+      </w:r>
+      <w:r>
+        <w:rPr>
+          <w:sz w:val="24"/>
+          <w:szCs w:val="24"/>
+          <w:lang w:val="en-US"/>
+        </w:rPr>
+        <w:t xml:space="preserve">. Resistance will be estimated using </w:t>
+      </w:r>
+      <w:r>
+        <w:rPr>
+          <w:sz w:val="24"/>
+          <w:szCs w:val="24"/>
+          <w:lang w:val="en-US"/>
+        </w:rPr>
+        <w:t xml:space="preserve">a </w:t>
+      </w:r>
+      <w:r>
+        <w:rPr>
+          <w:sz w:val="24"/>
+          <w:szCs w:val="24"/>
+          <w:lang w:val="en-US"/>
+        </w:rPr>
+        <w:t>liquid assay sco</w:t>
+      </w:r>
+      <w:r>
+        <w:rPr>
+          <w:sz w:val="24"/>
+          <w:szCs w:val="24"/>
+          <w:lang w:val="en-US"/>
+        </w:rPr>
+        <w:t xml:space="preserve">re by calculating </w:t>
+      </w:r>
+      <w:r>
+        <w:rPr>
+          <w:sz w:val="24"/>
+          <w:szCs w:val="24"/>
+          <w:lang w:val="en-US"/>
+        </w:rPr>
+        <w:t xml:space="preserve">the </w:t>
+      </w:r>
+      <w:r>
+        <w:rPr>
+          <w:sz w:val="24"/>
+          <w:szCs w:val="24"/>
+          <w:lang w:val="en-US"/>
+        </w:rPr>
+        <w:t xml:space="preserve">area under the curve for both growth curves with and without phages: </w:t>
       </w:r>
     </w:p>
     <w:p>
@@ -2827,16 +3154,7 @@
               <w:szCs w:val="24"/>
               <w:lang w:val="en-US"/>
             </w:rPr>
-            <m:t>∙10</m:t>
-          </m:r>
-          <m:r>
-            <w:rPr>
-              <w:rFonts w:ascii="Cambria Math" w:hAnsi="Cambria Math"/>
-              <w:sz w:val="24"/>
-              <w:szCs w:val="24"/>
-              <w:lang w:val="en-US"/>
-            </w:rPr>
-            <m:t>0</m:t>
+            <m:t>∙100</m:t>
           </m:r>
         </m:oMath>
       </m:oMathPara>
@@ -2855,6 +3173,7 @@
     </w:p>
     <w:p>
       <w:pPr>
+        <w:spacing w:line="360" w:lineRule="auto"/>
         <w:rPr>
           <w:b/>
           <w:bCs/>
@@ -2872,21 +3191,23 @@
 </file>
 
 <file path=word/numbering.xml><?xml version="1.0" encoding="utf-8"?>
-<w:numbering xmlns:wpc="http://schemas.microsoft.com/office/word/2010/wordprocessingCanvas" xmlns:cx="http://schemas.microsoft.com/office/drawing/2014/chartex" xmlns:cx1="http://schemas.microsoft.com/office/drawing/2015/9/8/chartex" xmlns:cx2="http://schemas.microsoft.com/office/drawing/2015/10/21/chartex" xmlns:cx3="http://schemas.microsoft.com/office/drawing/2016/5/9/chartex" xmlns:cx4="http://schemas.microsoft.com/office/drawing/2016/5/10/chartex" xmlns:cx5="http://schemas.microsoft.com/office/drawing/2016/5/11/chartex" xmlns:cx6="http://schemas.microsoft.com/office/drawing/2016/5/12/chartex" xmlns:cx7="http://schemas.microsoft.com/office/drawing/2016/5/13/chartex" xmlns:cx8="http://schemas.microsoft.com/office/drawing/2016/5/14/chartex" xmlns:mc="http://schemas.openxmlformats.org/markup-compatibility/2006" xmlns:aink="http://schemas.microsoft.com/office/drawing/2016/ink" xmlns:am3d="http://schemas.microsoft.com/office/drawing/2017/model3d" xmlns:o="urn:schemas-microsoft-com:office:office" xmlns:r="http://schemas.openxmlformats.org/officeDocument/2006/relationships" xmlns:m="http://schemas.openxmlformats.org/officeDocument/2006/math" xmlns:v="urn:schemas-microsoft-com:vml" xmlns:wp14="http://schemas.microsoft.com/office/word/2010/wordprocessingDrawing" xmlns:wp="http://schemas.openxmlformats.org/drawingml/2006/wordprocessingDrawing" xmlns:w10="urn:schemas-microsoft-com:office:word" xmlns:w="http://schemas.openxmlformats.org/wordprocessingml/2006/main" xmlns:w14="http://schemas.microsoft.com/office/word/2010/wordml" xmlns:w15="http://schemas.microsoft.com/office/word/2012/wordml" xmlns:w16cex="http://schemas.microsoft.com/office/word/2018/wordml/cex" xmlns:w16cid="http://schemas.microsoft.com/office/word/2016/wordml/cid" xmlns:w16="http://schemas.microsoft.com/office/word/2018/wordml" xmlns:w16se="http://schemas.microsoft.com/office/word/2015/wordml/symex" xmlns:wpg="http://schemas.microsoft.com/office/word/2010/wordprocessingGroup" xmlns:wpi="http://schemas.microsoft.com/office/word/2010/wordprocessingInk" xmlns:wne="http://schemas.microsoft.com/office/word/2006/wordml" xmlns:wps="http://schemas.microsoft.com/office/word/2010/wordprocessingShape" mc:Ignorable="w14 w15 w16se w16cid w16 w16cex wp14">
+<w:numbering xmlns:wpc="http://schemas.microsoft.com/office/word/2010/wordprocessingCanvas" xmlns:cx="http://schemas.microsoft.com/office/drawing/2014/chartex" xmlns:cx1="http://schemas.microsoft.com/office/drawing/2015/9/8/chartex" xmlns:cx2="http://schemas.microsoft.com/office/drawing/2015/10/21/chartex" xmlns:cx3="http://schemas.microsoft.com/office/drawing/2016/5/9/chartex" xmlns:cx4="http://schemas.microsoft.com/office/drawing/2016/5/10/chartex" xmlns:cx5="http://schemas.microsoft.com/office/drawing/2016/5/11/chartex" xmlns:cx6="http://schemas.microsoft.com/office/drawing/2016/5/12/chartex" xmlns:cx7="http://schemas.microsoft.com/office/drawing/2016/5/13/chartex" xmlns:cx8="http://schemas.microsoft.com/office/drawing/2016/5/14/chartex" xmlns:mc="http://schemas.openxmlformats.org/markup-compatibility/2006" xmlns:m="http://schemas.openxmlformats.org/officeDocument/2006/math" xmlns:aink="http://schemas.microsoft.com/office/drawing/2016/ink" xmlns:am3d="http://schemas.microsoft.com/office/drawing/2017/model3d" xmlns:oel="http://schemas.microsoft.com/office/2019/extlst" xmlns:r="http://schemas.openxmlformats.org/officeDocument/2006/relationships" xmlns:wp14="http://schemas.microsoft.com/office/word/2010/wordprocessingDrawing" xmlns:wp="http://schemas.openxmlformats.org/drawingml/2006/wordprocessingDrawing" xmlns:wpg="http://schemas.microsoft.com/office/word/2010/wordprocessingGroup" xmlns:wpi="http://schemas.microsoft.com/office/word/2010/wordprocessingInk" xmlns:wps="http://schemas.microsoft.com/office/word/2010/wordprocessingShape" xmlns:o="urn:schemas-microsoft-com:office:office" xmlns:v="urn:schemas-microsoft-com:vml" xmlns:w10="urn:schemas-microsoft-com:office:word" xmlns:w="http://schemas.openxmlformats.org/wordprocessingml/2006/main" xmlns:w14="http://schemas.microsoft.com/office/word/2010/wordml" xmlns:w15="http://schemas.microsoft.com/office/word/2012/wordml" xmlns:w16cex="http://schemas.microsoft.com/office/word/2018/wordml/cex" xmlns:w16cid="http://schemas.microsoft.com/office/word/2016/wordml/cid" xmlns:w16="http://schemas.microsoft.com/office/word/2018/wordml" xmlns:w16sdtdh="http://schemas.microsoft.com/office/word/2020/wordml/sdtdatahash" xmlns:w16sdtfl="http://schemas.microsoft.com/office/word/2024/wordml/sdtformatlock" xmlns:w16se="http://schemas.microsoft.com/office/word/2015/wordml/symex" xmlns:w16du="http://schemas.microsoft.com/office/word/2023/wordml/word16du" xmlns:wne="http://schemas.microsoft.com/office/word/2006/wordml" mc:Ignorable="w14 w15 w16se w16cid w16 w16cex w16sdtdh w16sdtfl w16du wp14">
   <w:abstractNum w:abstractNumId="0" w15:restartNumberingAfterBreak="0">
     <w:nsid w:val="3C960ED0"/>
     <w:multiLevelType w:val="hybridMultilevel"/>
-    <w:tmpl w:val="9E8ABEF0"/>
-    <w:lvl w:ilvl="0" w:tplc="0809000F">
+    <w:tmpl w:val="DED8A71A"/>
+    <w:lvl w:ilvl="0" w:tplc="2EB66B36">
       <w:start w:val="1"/>
       <w:numFmt w:val="decimal"/>
       <w:lvlText w:val="%1."/>
       <w:lvlJc w:val="left"/>
       <w:pPr>
-        <w:ind w:left="720" w:hanging="360"/>
+        <w:ind w:left="810" w:hanging="360"/>
       </w:pPr>
       <w:rPr>
         <w:rFonts w:hint="default"/>
+        <w:b w:val="0"/>
+        <w:bCs w:val="0"/>
       </w:rPr>
     </w:lvl>
     <w:lvl w:ilvl="1" w:tplc="08090019" w:tentative="1">
@@ -2962,21 +3283,21 @@
       </w:pPr>
     </w:lvl>
   </w:abstractNum>
-  <w:num w:numId="1">
+  <w:num w:numId="1" w16cid:durableId="1757940334">
     <w:abstractNumId w:val="0"/>
   </w:num>
 </w:numbering>
 </file>
 
 <file path=word/styles.xml><?xml version="1.0" encoding="utf-8"?>
-<w:styles xmlns:mc="http://schemas.openxmlformats.org/markup-compatibility/2006" xmlns:r="http://schemas.openxmlformats.org/officeDocument/2006/relationships" xmlns:w="http://schemas.openxmlformats.org/wordprocessingml/2006/main" xmlns:w14="http://schemas.microsoft.com/office/word/2010/wordml" xmlns:w15="http://schemas.microsoft.com/office/word/2012/wordml" xmlns:w16cex="http://schemas.microsoft.com/office/word/2018/wordml/cex" xmlns:w16cid="http://schemas.microsoft.com/office/word/2016/wordml/cid" xmlns:w16="http://schemas.microsoft.com/office/word/2018/wordml" xmlns:w16se="http://schemas.microsoft.com/office/word/2015/wordml/symex" mc:Ignorable="w14 w15 w16se w16cid w16 w16cex">
+<w:styles xmlns:mc="http://schemas.openxmlformats.org/markup-compatibility/2006" xmlns:r="http://schemas.openxmlformats.org/officeDocument/2006/relationships" xmlns:w="http://schemas.openxmlformats.org/wordprocessingml/2006/main" xmlns:w14="http://schemas.microsoft.com/office/word/2010/wordml" xmlns:w15="http://schemas.microsoft.com/office/word/2012/wordml" xmlns:w16cex="http://schemas.microsoft.com/office/word/2018/wordml/cex" xmlns:w16cid="http://schemas.microsoft.com/office/word/2016/wordml/cid" xmlns:w16="http://schemas.microsoft.com/office/word/2018/wordml" xmlns:w16sdtdh="http://schemas.microsoft.com/office/word/2020/wordml/sdtdatahash" xmlns:w16sdtfl="http://schemas.microsoft.com/office/word/2024/wordml/sdtformatlock" xmlns:w16se="http://schemas.microsoft.com/office/word/2015/wordml/symex" xmlns:w16du="http://schemas.microsoft.com/office/word/2023/wordml/word16du" mc:Ignorable="w14 w15 w16se w16cid w16 w16cex w16sdtdh w16sdtfl w16du">
   <w:docDefaults>
     <w:rPrDefault>
       <w:rPr>
         <w:rFonts w:asciiTheme="minorHAnsi" w:eastAsiaTheme="minorHAnsi" w:hAnsiTheme="minorHAnsi" w:cstheme="minorBidi"/>
         <w:sz w:val="24"/>
         <w:szCs w:val="24"/>
-        <w:lang w:val="en-DE" w:eastAsia="en-US" w:bidi="ar-SA"/>
+        <w:lang w:eastAsia="en-US" w:bidi="ar-SA"/>
       </w:rPr>
     </w:rPrDefault>
     <w:pPrDefault/>

</xml_diff>